<commit_message>
Count text boxes, equations, and shapes only where docx-preview does not draw them
docx-preview 0.4.1 draws VML text boxes (also as the fallback of a DrawingML
text box), most OMML as MathML, and VML rectangles, ovals, and lines. The
core now counts these features only in the forms it drops, so every item in
the fidelity bar is really not displayed. The rules and evidence sit beside
FeatureIsNotDisplayed().

Also count a locked canvas as one shape, unwrap every w:fldSimple to its
cached result (docx-preview drops the element with its content), and add
features/drawn-content.docx.
</commit_message>
<xml_diff>
--- a/tests/fixtures/features/not-displayed.docx
+++ b/tests/fixtures/features/not-displayed.docx
@@ -15,93 +15,70 @@
         <w:t xml:space="preserve">A text box: </w:t>
       </w:r>
       <w:r>
-        <mc:AlternateContent>
-          <mc:Choice Requires="wps">
-            <w:drawing>
-              <wp:anchor distT="0" distB="0" distL="114300" distR="114300" simplePos="0" relativeHeight="251659264" behindDoc="0" locked="0" layoutInCell="1" allowOverlap="1">
-                <wp:simplePos x="0" y="0"/>
-                <wp:positionH relativeFrom="column">
-                  <wp:posOffset>0</wp:posOffset>
-                </wp:positionH>
-                <wp:positionV relativeFrom="paragraph">
-                  <wp:posOffset>0</wp:posOffset>
-                </wp:positionV>
-                <wp:extent cx="2286000" cy="457200"/>
-                <wp:effectExtent l="0" t="0" r="0" b="0"/>
-                <wp:wrapSquare wrapText="bothSides"/>
-                <wp:docPr id="1" name="Text Box 1"/>
-                <wp:cNvGraphicFramePr/>
-                <a:graphic>
-                  <a:graphicData uri="http://schemas.microsoft.com/office/word/2010/wordprocessingShape">
-                    <wps:wsp>
-                      <wps:cNvSpPr txBox="1"/>
-                      <wps:spPr>
-                        <a:xfrm>
-                          <a:off x="0" y="0"/>
-                          <a:ext cx="2286000" cy="457200"/>
-                        </a:xfrm>
-                        <a:prstGeom prst="rect">
-                          <a:avLst/>
-                        </a:prstGeom>
-                      </wps:spPr>
-                      <wps:txbx>
-                        <w:txbxContent>
-                          <w:p>
-                            <w:r>
-                              <w:t xml:space="preserve">Text inside a text box.</w:t>
-                            </w:r>
-                          </w:p>
-                        </w:txbxContent>
-                      </wps:txbx>
-                      <wps:bodyPr/>
-                    </wps:wsp>
-                  </a:graphicData>
-                </a:graphic>
-              </wp:anchor>
-            </w:drawing>
-          </mc:Choice>
-          <mc:Fallback>
-            <w:pict>
-              <v:shape id="Text Box 1" type="#_x0000_t202" style="width:180pt;height:36pt">
-                <v:textbox>
-                  <w:txbxContent>
-                    <w:p>
-                      <w:r>
-                        <w:t xml:space="preserve">Text inside a text box.</w:t>
-                      </w:r>
-                    </w:p>
-                  </w:txbxContent>
-                </v:textbox>
-              </v:shape>
-            </w:pict>
-          </mc:Fallback>
-        </mc:AlternateContent>
+        <w:drawing>
+          <wp:anchor distT="0" distB="0" distL="114300" distR="114300" simplePos="0" relativeHeight="251659265" behindDoc="0" locked="0" layoutInCell="1" allowOverlap="1">
+            <wp:simplePos x="0" y="0"/>
+            <wp:positionH relativeFrom="column">
+              <wp:posOffset>0</wp:posOffset>
+            </wp:positionH>
+            <wp:positionV relativeFrom="paragraph">
+              <wp:posOffset>0</wp:posOffset>
+            </wp:positionV>
+            <wp:extent cx="2286000" cy="457200"/>
+            <wp:effectExtent l="0" t="0" r="0" b="0"/>
+            <wp:wrapSquare wrapText="bothSides"/>
+            <wp:docPr id="1" name="Text Box 1"/>
+            <wp:cNvGraphicFramePr/>
+            <a:graphic>
+              <a:graphicData uri="http://schemas.microsoft.com/office/word/2010/wordprocessingShape">
+                <wps:wsp>
+                  <wps:cNvSpPr txBox="1"/>
+                  <wps:spPr>
+                    <a:xfrm>
+                      <a:off x="0" y="0"/>
+                      <a:ext cx="2286000" cy="457200"/>
+                    </a:xfrm>
+                    <a:prstGeom prst="rect">
+                      <a:avLst/>
+                    </a:prstGeom>
+                  </wps:spPr>
+                  <wps:txbx>
+                    <w:txbxContent>
+                      <w:p>
+                        <w:r>
+                          <w:t xml:space="preserve">Text inside a text box.</w:t>
+                        </w:r>
+                      </w:p>
+                    </w:txbxContent>
+                  </wps:txbx>
+                  <wps:bodyPr/>
+                </wps:wsp>
+              </a:graphicData>
+            </a:graphic>
+          </wp:anchor>
+        </w:drawing>
       </w:r>
     </w:p>
     <w:p>
       <m:oMathPara>
         <m:oMath>
-          <m:r>
-            <m:t>E</m:t>
-          </m:r>
-          <m:r>
-            <m:t>=</m:t>
-          </m:r>
-          <m:r>
-            <m:t>m</m:t>
-          </m:r>
-          <m:sSup>
+          <m:sSubSup>
             <m:e>
               <m:r>
-                <m:t>c</m:t>
+                <m:t>x</m:t>
               </m:r>
             </m:e>
+            <m:sub>
+              <m:r>
+                <m:t>i</m:t>
+              </m:r>
+            </m:sub>
             <m:sup>
               <m:r>
                 <m:t>2</m:t>
               </m:r>
             </m:sup>
-          </m:sSup>
+          </m:sSubSup>
         </m:oMath>
       </m:oMathPara>
     </w:p>
@@ -180,7 +157,7 @@
           </mc:Choice>
           <mc:Fallback>
             <w:pict>
-              <v:rect id="Rectangle 2" style="width:72pt;height:36pt" fillcolor="#4472c4"/>
+              <v:roundrect id="Rectangle 2" style="width:72pt;height:36pt" fillcolor="#4472c4"/>
             </w:pict>
           </mc:Fallback>
         </mc:AlternateContent>

</xml_diff>